<commit_message>
Final Commit for Version 3.
</commit_message>
<xml_diff>
--- a/Documentations/Dynamic Trailing Stop & Profit Target System.docx
+++ b/Documentations/Dynamic Trailing Stop & Profit Target System.docx
@@ -312,7 +312,6 @@
     <w:p/>
     <w:p>
       <w:r>
-        <w:lastRenderedPageBreak/>
         <w:t>[Position History] → [Pattern Recognition] → [Intelligent Defense Stage]</w:t>
       </w:r>
     </w:p>
@@ -434,14 +433,14 @@
         <w:tblLook w:val="04A0" w:firstRow="1" w:lastRow="0" w:firstColumn="1" w:lastColumn="0" w:noHBand="0" w:noVBand="1"/>
       </w:tblPr>
       <w:tblGrid>
-        <w:gridCol w:w="1035"/>
-        <w:gridCol w:w="1126"/>
-        <w:gridCol w:w="1156"/>
-        <w:gridCol w:w="1159"/>
-        <w:gridCol w:w="1241"/>
-        <w:gridCol w:w="1028"/>
-        <w:gridCol w:w="1379"/>
         <w:gridCol w:w="1236"/>
+        <w:gridCol w:w="1288"/>
+        <w:gridCol w:w="1324"/>
+        <w:gridCol w:w="1328"/>
+        <w:gridCol w:w="1431"/>
+        <w:gridCol w:w="1165"/>
+        <w:gridCol w:w="1603"/>
+        <w:gridCol w:w="1425"/>
       </w:tblGrid>
       <w:tr>
         <w:trPr>
@@ -955,7 +954,6 @@
           </w:tcPr>
           <w:p>
             <w:r>
-              <w:lastRenderedPageBreak/>
               <w:t>STAGE_1</w:t>
             </w:r>
           </w:p>
@@ -1418,6 +1416,7 @@
           </w:tcPr>
           <w:p>
             <w:r>
+              <w:lastRenderedPageBreak/>
               <w:t>STAGE_2B</w:t>
             </w:r>
           </w:p>
@@ -2034,7 +2033,6 @@
           </w:tcPr>
           <w:p>
             <w:r>
-              <w:lastRenderedPageBreak/>
               <w:t>STAGE_4</w:t>
             </w:r>
           </w:p>
@@ -2549,6 +2547,7 @@
         </w:numPr>
       </w:pPr>
       <w:r>
+        <w:lastRenderedPageBreak/>
         <w:t>Portfolio drawdown &gt; 10%</w:t>
       </w:r>
     </w:p>
@@ -2692,7 +2691,6 @@
           <w:b/>
           <w:bCs/>
         </w:rPr>
-        <w:lastRenderedPageBreak/>
         <w:t>5. ADVANCED REGRESSION DEFENSE SYSTEM v4.0.1</w:t>
       </w:r>
     </w:p>
@@ -3003,6 +3001,7 @@
     </w:p>
     <w:p>
       <w:r>
+        <w:lastRenderedPageBreak/>
         <w:t xml:space="preserve">    '</w:t>
       </w:r>
       <w:proofErr w:type="spellStart"/>
@@ -3136,7 +3135,6 @@
     </w:p>
     <w:p>
       <w:r>
-        <w:lastRenderedPageBreak/>
         <w:t xml:space="preserve">        'detection': 'position.sl == 0.0 AND </w:t>
       </w:r>
       <w:proofErr w:type="spellStart"/>
@@ -3459,6 +3457,7 @@
     </w:p>
     <w:p>
       <w:r>
+        <w:lastRenderedPageBreak/>
         <w:t xml:space="preserve">    </w:t>
       </w:r>
       <w:r>
@@ -3524,7 +3523,6 @@
     </w:p>
     <w:p>
       <w:r>
-        <w:lastRenderedPageBreak/>
         <w:t xml:space="preserve">    </w:t>
       </w:r>
     </w:p>
@@ -3560,11 +3558,11 @@
         <w:tblLook w:val="04A0" w:firstRow="1" w:lastRow="0" w:firstColumn="1" w:lastColumn="0" w:noHBand="0" w:noVBand="1"/>
       </w:tblPr>
       <w:tblGrid>
-        <w:gridCol w:w="1677"/>
+        <w:gridCol w:w="2133"/>
         <w:gridCol w:w="2266"/>
-        <w:gridCol w:w="1856"/>
-        <w:gridCol w:w="1921"/>
-        <w:gridCol w:w="1640"/>
+        <w:gridCol w:w="2116"/>
+        <w:gridCol w:w="2397"/>
+        <w:gridCol w:w="1888"/>
       </w:tblGrid>
       <w:tr>
         <w:trPr>
@@ -4241,22 +4239,22 @@
     <w:p/>
     <w:p>
       <w:r>
+        <w:t>RULE 1: STAGE_0 = 30-pip fixed stop, ALWAYS SET ON ENTRY</w:t>
+      </w:r>
+    </w:p>
+    <w:p>
+      <w:r>
+        <w:t>RULE 2: If no SL exists, SET SL IMMEDIATELY (Safety First Protocol)</w:t>
+      </w:r>
+    </w:p>
+    <w:p>
+      <w:r>
+        <w:t>RULE 3: If SL exists, only change if NEW SL provides BETTER protection</w:t>
+      </w:r>
+    </w:p>
+    <w:p>
+      <w:r>
         <w:lastRenderedPageBreak/>
-        <w:t>RULE 1: STAGE_0 = 30-pip fixed stop, ALWAYS SET ON ENTRY</w:t>
-      </w:r>
-    </w:p>
-    <w:p>
-      <w:r>
-        <w:t>RULE 2: If no SL exists, SET SL IMMEDIATELY (Safety First Protocol)</w:t>
-      </w:r>
-    </w:p>
-    <w:p>
-      <w:r>
-        <w:t>RULE 3: If SL exists, only change if NEW SL provides BETTER protection</w:t>
-      </w:r>
-    </w:p>
-    <w:p>
-      <w:r>
         <w:t>RULE 4: If values are identical (±0.00001), DO NOT MODIFY (avoid ping-pong)</w:t>
       </w:r>
     </w:p>
@@ -4640,7 +4638,6 @@
     </w:p>
     <w:p>
       <w:r>
-        <w:lastRenderedPageBreak/>
         <w:t xml:space="preserve">        return </w:t>
       </w:r>
       <w:proofErr w:type="spellStart"/>
@@ -4769,6 +4766,7 @@
           <w:b/>
           <w:bCs/>
         </w:rPr>
+        <w:lastRenderedPageBreak/>
         <w:t>Act</w:t>
       </w:r>
       <w:r>
@@ -5198,7 +5196,6 @@
           <w:b/>
           <w:bCs/>
         </w:rPr>
-        <w:lastRenderedPageBreak/>
         <w:t>TC-SL-005</w:t>
       </w:r>
       <w:r>
@@ -5329,6 +5326,7 @@
     </w:p>
     <w:p>
       <w:r>
+        <w:lastRenderedPageBreak/>
         <w:t xml:space="preserve">    '</w:t>
       </w:r>
       <w:proofErr w:type="spellStart"/>
@@ -5673,7 +5671,6 @@
     </w:p>
     <w:p>
       <w:r>
-        <w:lastRenderedPageBreak/>
         <w:t xml:space="preserve">    </w:t>
       </w:r>
       <w:r>
@@ -5907,6 +5904,7 @@
           <w:b/>
           <w:bCs/>
         </w:rPr>
+        <w:lastRenderedPageBreak/>
         <w:t>SAFETY CRITICAL</w:t>
       </w:r>
       <w:r>
@@ -6075,7 +6073,6 @@
     </w:p>
     <w:p>
       <w:r>
-        <w:lastRenderedPageBreak/>
         <w:t xml:space="preserve">        '</w:t>
       </w:r>
       <w:proofErr w:type="spellStart"/>
@@ -6350,6 +6347,7 @@
     </w:p>
     <w:p>
       <w:r>
+        <w:lastRenderedPageBreak/>
         <w:t>}</w:t>
       </w:r>
     </w:p>
@@ -6478,7 +6476,6 @@
     </w:p>
     <w:p>
       <w:r>
-        <w:lastRenderedPageBreak/>
         <w:t xml:space="preserve">    '</w:t>
       </w:r>
       <w:proofErr w:type="spellStart"/>
@@ -6706,10 +6703,10 @@
         <w:tblLook w:val="04A0" w:firstRow="1" w:lastRow="0" w:firstColumn="1" w:lastColumn="0" w:noHBand="0" w:noVBand="1"/>
       </w:tblPr>
       <w:tblGrid>
-        <w:gridCol w:w="2245"/>
-        <w:gridCol w:w="3344"/>
+        <w:gridCol w:w="2608"/>
+        <w:gridCol w:w="3992"/>
         <w:gridCol w:w="1472"/>
-        <w:gridCol w:w="2299"/>
+        <w:gridCol w:w="2728"/>
       </w:tblGrid>
       <w:tr>
         <w:trPr>
@@ -6732,6 +6729,7 @@
           </w:tcPr>
           <w:p>
             <w:r>
+              <w:lastRenderedPageBreak/>
               <w:t>Conflict Scenario</w:t>
             </w:r>
           </w:p>
@@ -7148,7 +7146,6 @@
           </w:tcPr>
           <w:p>
             <w:r>
-              <w:lastRenderedPageBreak/>
               <w:t>Hysteresis vs Defense</w:t>
             </w:r>
           </w:p>
@@ -7529,6 +7526,7 @@
     </w:p>
     <w:p>
       <w:r>
+        <w:lastRenderedPageBreak/>
         <w:t xml:space="preserve">        'priority': 'MEDIUM'</w:t>
       </w:r>
     </w:p>
@@ -7562,7 +7560,6 @@
     </w:p>
     <w:p>
       <w:r>
-        <w:lastRenderedPageBreak/>
         <w:t xml:space="preserve">        'action': '</w:t>
       </w:r>
       <w:proofErr w:type="spellStart"/>
@@ -7918,6 +7915,7 @@
     </w:p>
     <w:p>
       <w:r>
+        <w:lastRenderedPageBreak/>
         <w:t xml:space="preserve">        '</w:t>
       </w:r>
       <w:proofErr w:type="spellStart"/>
@@ -7936,7 +7934,6 @@
     </w:p>
     <w:p>
       <w:r>
-        <w:lastRenderedPageBreak/>
         <w:t xml:space="preserve">        'priority': 'HIGHEST'</w:t>
       </w:r>
     </w:p>
@@ -8258,7 +8255,6 @@
           <w:b/>
           <w:bCs/>
         </w:rPr>
-        <w:lastRenderedPageBreak/>
         <w:t>Regression Detection</w:t>
       </w:r>
       <w:r>
@@ -8295,6 +8291,7 @@
           <w:b/>
           <w:bCs/>
         </w:rPr>
+        <w:lastRenderedPageBreak/>
         <w:t>Profit Protection</w:t>
       </w:r>
       <w:r>
@@ -8697,7 +8694,6 @@
         </w:numPr>
       </w:pPr>
       <w:r>
-        <w:lastRenderedPageBreak/>
         <w:t>Complete failure of protection system</w:t>
       </w:r>
     </w:p>
@@ -8794,6 +8790,7 @@
           <w:b/>
           <w:bCs/>
         </w:rPr>
+        <w:lastRenderedPageBreak/>
         <w:t>Audit trail</w:t>
       </w:r>
       <w:r>
@@ -9135,7 +9132,6 @@
     </w:p>
     <w:p>
       <w:r>
-        <w:lastRenderedPageBreak/>
         <w:t xml:space="preserve">    v4_data = </w:t>
       </w:r>
       <w:proofErr w:type="spellStart"/>
@@ -9244,6 +9240,7 @@
     </w:p>
     <w:p>
       <w:r>
+        <w:lastRenderedPageBreak/>
         <w:t xml:space="preserve">        data['</w:t>
       </w:r>
       <w:proofErr w:type="spellStart"/>
@@ -9510,7 +9507,6 @@
         </w:numPr>
       </w:pPr>
       <w:r>
-        <w:lastRenderedPageBreak/>
         <w:t>MT5 terminal connection</w:t>
       </w:r>
     </w:p>
@@ -9656,6 +9652,7 @@
     <w:p>
       <w:proofErr w:type="spellStart"/>
       <w:r>
+        <w:lastRenderedPageBreak/>
         <w:t>json</w:t>
       </w:r>
       <w:proofErr w:type="spellEnd"/>
@@ -9859,7 +9856,6 @@
         </w:numPr>
       </w:pPr>
       <w:r>
-        <w:lastRenderedPageBreak/>
         <w:t>Must log all SL modification attempts with before/after values</w:t>
       </w:r>
     </w:p>
@@ -10073,6 +10069,7 @@
           <w:b/>
           <w:bCs/>
         </w:rPr>
+        <w:lastRenderedPageBreak/>
         <w:t>MT5 modification errors</w:t>
       </w:r>
       <w:r>
@@ -10224,7 +10221,6 @@
     </w:p>
     <w:p>
       <w:r>
-        <w:lastRenderedPageBreak/>
         <w:t>TC-DEF-001 to TC-DEF-008: Defense Activation Tests</w:t>
       </w:r>
     </w:p>
@@ -10311,7 +10307,7 @@
     <w:p>
       <w:r>
         <w:pict w14:anchorId="260E89C4">
-          <v:rect id="_x0000_i1033" style="width:0;height:.75pt" o:hralign="center" o:hrstd="t" o:hr="t" fillcolor="#a0a0a0" stroked="f"/>
+          <v:rect id="_x0000_i1025" style="width:0;height:.75pt" o:hralign="center" o:hrstd="t" o:hr="t" fillcolor="#a0a0a0" stroked="f"/>
         </w:pict>
       </w:r>
     </w:p>
@@ -10382,7 +10378,7 @@
     <w:p/>
     <w:sectPr>
       <w:pgSz w:w="12240" w:h="15840"/>
-      <w:pgMar w:top="1440" w:right="1440" w:bottom="1440" w:left="1440" w:header="720" w:footer="720" w:gutter="0"/>
+      <w:pgMar w:top="720" w:right="720" w:bottom="720" w:left="720" w:header="720" w:footer="720" w:gutter="0"/>
       <w:cols w:space="720"/>
       <w:docGrid w:linePitch="360"/>
     </w:sectPr>
@@ -42115,6 +42111,7 @@
   <w:style w:type="character" w:default="1" w:styleId="DefaultParagraphFont">
     <w:name w:val="Default Paragraph Font"/>
     <w:uiPriority w:val="1"/>
+    <w:semiHidden/>
     <w:unhideWhenUsed/>
   </w:style>
   <w:style w:type="table" w:default="1" w:styleId="TableNormal">

</xml_diff>